<commit_message>
Refactor to audit/ package (behavior unchanged) + final audit fixes
- Reorganize 39 scripts into audit/{core,pipeline,experiments,figures,tools}; imports
  and __file__ paths updated; smoke test reproduces 0.9284/0.9938 byte-identically.
- Add ARCHITECTURE.md; README/REPRODUCE now use 'python -m audit.<pkg>.<mod>'.
- Fix Fig 2 caption panel labels (ensembl=middle, nontata=left); move Fig 1 legend off
  the bars and reconcile its bar heights to the 11.8/16.5-pt headline drops.
- main.tex: 4.9 CI 0.092; 4.8 seed-consistent 0.696/0.820; Table 2 drosophila +0.012.
- Response letter: fix 6 split hyphenated words + a section ref; cover letter: stack
  the address and signature blocks.

Co-Authored-By: Claude Opus 4.8 <noreply@anthropic.com>
</commit_message>
<xml_diff>
--- a/paper/cover_letter.docx
+++ b/paper/cover_letter.docx
@@ -19,7 +19,7 @@
         <w:t xml:space="preserve">To: Dr. Lina Ma, Editor-in-Chief, and the Editorial Office</w:t>
       </w:r>
       <w:r>
-        <w:t xml:space="preserve"> </w:t>
+        <w:br/>
       </w:r>
       <w:r>
         <w:t xml:space="preserve">Bioinformatics Advances</w:t>
@@ -299,19 +299,19 @@
         <w:t xml:space="preserve">Sincerely,</w:t>
       </w:r>
       <w:r>
-        <w:t xml:space="preserve"> </w:t>
+        <w:br/>
       </w:r>
       <w:r>
         <w:t xml:space="preserve">Rikhin Kavuru</w:t>
       </w:r>
       <w:r>
-        <w:t xml:space="preserve"> </w:t>
+        <w:br/>
       </w:r>
       <w:r>
         <w:t xml:space="preserve">Independent Researcher</w:t>
       </w:r>
       <w:r>
-        <w:t xml:space="preserve"> </w:t>
+        <w:br/>
       </w:r>
       <w:r>
         <w:t xml:space="preserve">rikhinkavuru@gmail.com</w:t>

</xml_diff>